<commit_message>
Pearson: add Copilot (evaluated at Solenzo); record in profile
Co-Authored-By: Claude Opus 5.5 <noreply@anthropic.com>
Claude-Session: https://claude.ai/code/session_01XE6aV5LP3W9C1iWzBfgedS
</commit_message>
<xml_diff>
--- a/applications/pearson-advanced-specialist-solutioning/Pearson-AdvancedSpecialistSolutioning-Resume.docx
+++ b/applications/pearson-advanced-specialist-solutioning/Pearson-AdvancedSpecialistSolutioning-Resume.docx
@@ -225,7 +225,7 @@
           <w:i w:val="0"/>
           <w:color w:val="1A1A1A"/>
         </w:rPr>
-        <w:t>Use AI tools daily to accelerate research, analysis, proposal drafting, and solution design, and built rubric-based evaluation to keep AI output accurate.</w:t>
+        <w:t>Use AI tools daily (Claude, ChatGPT) to accelerate research, analysis, proposal drafting, and solution design, evaluated Microsoft Copilot for client use, and built rubric-based evaluation to keep AI output accurate.</w:t>
       </w:r>
     </w:p>
     <w:p>
@@ -1020,7 +1020,7 @@
           <w:i w:val="0"/>
           <w:color w:val="1A1A1A"/>
         </w:rPr>
-        <w:t>PowerPoint, Excel, Salesforce, HubSpot, Claude, ChatGPT</w:t>
+        <w:t>PowerPoint, Excel, Salesforce, HubSpot, Claude, ChatGPT, Microsoft Copilot (evaluated)</w:t>
       </w:r>
     </w:p>
     <w:p>

</xml_diff>